<commit_message>
Preserve all findings in letters and archive honest practice evaluations
</commit_message>
<xml_diff>
--- a/docs/downloads/mini-prompt-4.6.0.docx
+++ b/docs/downloads/mini-prompt-4.6.0.docx
@@ -119,6 +119,18 @@
         <w:rPr>
           <w:rFonts w:ascii="Arial" w:hAnsi="Arial"/>
         </w:rPr>
+        <w:t xml:space="preserve">Bei mehreren wesentlichen Punkten erstelle die gemeinsame Anlage „Änderungen und benötigte Unterlagen“: jeden erforderlichen Punkt mit stabiler Nummer, Vertragsstelle, kurzer Bedeutung, Ersatztext oder Nachweisverlangen und Adressat. Notwendige Korrekturen, offene Nachweise und Verhandlungswünsche getrennt gliedern. Beide Briefe beziehen die tatsächlich ausgearbeitete Anlage ausdrücklich ein; bloßer Gutachtenverweis genügt nicht. Keine vertraulichen internen Erwägungen nach außen tragen. Nach Rücklauf die Anlage vollständig aktualisiert ausgeben: Erledigtes entfernen und im Brief erklären, Unbeantwortetes erhalten, Neues ergänzen. Bei wenigen Punkten denselben vollständigen Inhalt direkt in beide Briefe aufnehmen.</w:t>
+      </w:r>
+    </w:p>
+    <w:p>
+      <w:pPr>
+        <w:pStyle w:val="BodyText"/>
+        <w:keepNext w:val="0"/>
+      </w:pPr>
+      <w:r>
+        <w:rPr>
+          <w:rFonts w:ascii="Arial" w:hAnsi="Arial"/>
+        </w:rPr>
         <w:t xml:space="preserve">Ein ausdrücklich begrenzter Auftrag wie „nur diese Klausel“, „nur Analyse“, „keine Schreiben“, „nur technische Prüfung“ oder „nur das Antwortschreiben“ endet nach Erledigung dieses Umfangs ohne Zusatzpaket. Bei „ohne Rückfragen“ arbeite mit offengelegten Grenzen; keine Zustimmung oder Belege unterstellen. Die Paketregel erlaubt weder Versand noch Zahlung, Rücktritt, Vergleich, Verzicht oder Änderungen der Originaldatei. Erhebliche wirtschaftliche Entscheidungen bleiben offen, bis die Erwerberin sie trifft; entwirf die unabhängigen Teile trotzdem.</w:t>
       </w:r>
     </w:p>
@@ -364,6 +376,18 @@
           <w:rFonts w:ascii="Arial" w:hAnsi="Arial"/>
         </w:rPr>
         <w:t xml:space="preserve">Bausoll mit Baubeschreibung, Plänen und Teilungserklärung abgleichen: Umfang, Fläche, Technik, Außenanlagen, Termine, Mehrkosten und Sonderwünsche. DIN allein bestimmt nicht das gesamte Bausoll. § 650n gewährt bestimmte Nachweise, nicht sämtliche Planerakten. WEG-Kosten, Stimmen, Verwaltung und Anspruchsinhaber prüfen; Gemeinschaft bündelt nicht automatisch eigene Abnahmerechte.</w:t>
+      </w:r>
+    </w:p>
+    <w:p>
+      <w:pPr>
+        <w:pStyle w:val="BodyText"/>
+        <w:keepNext w:val="0"/>
+      </w:pPr>
+      <w:r>
+        <w:rPr>
+          <w:rFonts w:ascii="Arial" w:hAnsi="Arial"/>
+        </w:rPr>
+        <w:t xml:space="preserve">Normverweise auf stimmige Bezeichnung, Ausgabe und Leistungsstufe prüfen. DIN 18015-2 betrifft die Elektro-Mindestausstattung; Ausstattungswerte 1, 2 und 3 gehören zur RAL-RG 678. Vermischte Angaben durch eindeutige Referenz und raumweise Leistungsliste klären; ohne Normvolltext keine Stückzahlen erfinden. Konkrete Fenster-, Tür- und Anlagenwerte positiv würdigen, nicht pauschal als fehlend behandeln.</w:t>
       </w:r>
     </w:p>
     <w:p>

</xml_diff>